<commit_message>
docs: finalize OPC-track materials with monochrome layout and implemented features
</commit_message>
<xml_diff>
--- a/submission/TA_Cup_2026/finalization/01b_参赛承诺书_未签名校对版.docx
+++ b/submission/TA_Cup_2026/finalization/01b_参赛承诺书_未签名校对版.docx
@@ -4,12 +4,14 @@
   <w:body>
     <w:p>
       <w:pPr>
-        <w:pStyle w:val="Title"/>
         <w:jc w:val="center"/>
       </w:pPr>
       <w:r>
         <w:rPr>
           <w:rFonts w:ascii="Noto Serif CJK SC" w:hAnsi="Noto Serif CJK SC" w:eastAsia="Noto Serif CJK SC"/>
+          <w:b/>
+          <w:color w:val="000000"/>
+          <w:sz w:val="38"/>
         </w:rPr>
         <w:t>参 赛 承 诺 书</w:t>
       </w:r>
@@ -21,21 +23,10 @@
       <w:r>
         <w:rPr>
           <w:rFonts w:ascii="Noto Serif CJK SC" w:hAnsi="Noto Serif CJK SC" w:eastAsia="Noto Serif CJK SC"/>
+          <w:color w:val="000000"/>
           <w:sz w:val="20"/>
         </w:rPr>
         <w:t>西安交通大学《电信T.A杯》“AI+教育”创新应用技能大赛</w:t>
-      </w:r>
-    </w:p>
-    <w:p>
-      <w:pPr>
-        <w:jc w:val="center"/>
-      </w:pPr>
-      <w:r>
-        <w:rPr>
-          <w:rFonts w:ascii="Noto Serif CJK SC" w:hAnsi="Noto Serif CJK SC" w:eastAsia="Noto Serif CJK SC"/>
-          <w:sz w:val="16"/>
-        </w:rPr>
-        <w:t>签名图片排版预览｜教师成员及官方模板待核对</w:t>
       </w:r>
     </w:p>
     <w:p>
@@ -45,9 +36,10 @@
       <w:r>
         <w:rPr>
           <w:rFonts w:ascii="Noto Serif CJK SC" w:hAnsi="Noto Serif CJK SC" w:eastAsia="Noto Serif CJK SC"/>
+          <w:color w:val="000000"/>
           <w:sz w:val="22"/>
         </w:rPr>
-        <w:t>本团队智教未来队（团队名称，负责人：____________）在此郑重声明：所开发的《领航云学堂——AI赋能的校园家教智能匹配与个性化学习服务平台》参赛作品及其相关成果，从设计思路、算法框架到核心知识库内容，均为自主独立完成或源于已公开发表的学术文献、开源资料，未抄袭、剽窃任何第三方成果。</w:t>
+        <w:t>智教未来队（负责人：____________）在此郑重声明：本团队提交的《领航云学堂——AI赋能的校园家教智能匹配与个性化学习服务平台》参赛作品及相关成果，系团队自主开发或依法使用公开资料、开源项目等形成，不存在抄袭、剽窃或其他侵犯第三方合法权益的行为。</w:t>
       </w:r>
     </w:p>
     <w:p>
@@ -57,9 +49,10 @@
       <w:r>
         <w:rPr>
           <w:rFonts w:ascii="Noto Serif CJK SC" w:hAnsi="Noto Serif CJK SC" w:eastAsia="Noto Serif CJK SC"/>
+          <w:color w:val="000000"/>
           <w:sz w:val="22"/>
         </w:rPr>
-        <w:t>在作品开发过程中，我们基于对真实教育（产业）场景需求的深入分析，通过自主研究和创新探索，设计了独特的功能架构与运行逻辑；知识库内容系经大量原始数据收集、整理、标注及专业领域知识的深度提炼，构建起具有创新性与独特性的知识体系。若有不实，愿承担相应法律责任。</w:t>
+        <w:t>本团队在作品开发中使用的开源代码、公开资料及第三方资源，均遵循相应许可与使用要求，并按需要标明来源。作品介绍、演示视频及支撑材料如实反映项目情况，不将未经验证的效果或经营情况作为既成成果申报。若有不实，愿承担相应责任。</w:t>
       </w:r>
     </w:p>
     <w:p>
@@ -69,15 +62,17 @@
       <w:r>
         <w:rPr>
           <w:rFonts w:ascii="Noto Serif CJK SC" w:hAnsi="Noto Serif CJK SC" w:eastAsia="Noto Serif CJK SC"/>
+          <w:color w:val="000000"/>
           <w:sz w:val="22"/>
         </w:rPr>
-        <w:t>本人（本团队）同时承诺：本次参赛作品仅选择一个赛道申报，未多头申报、重复申报；所提交的报名信息、作品介绍文档、演示视频及支撑材料均真实、准确、有效；严格遵守大赛评审纪律，不以任何方式干扰评审工作；同意大赛组委会在非商业用途下对参赛作品进行宣传、展示和推广。如有违反，愿接受大赛组委会取消参赛资格、收回荣誉证书及奖金的处理。</w:t>
+        <w:t>本团队同时承诺：本次参赛作品仅选择一个赛道申报，未多头申报、重复申报；所提交的报名信息、作品介绍文档、演示视频及支撑材料均真实、准确、有效；严格遵守大赛评审纪律，不以任何方式干扰评审工作；同意大赛组委会在非商业用途下对参赛作品进行宣传、展示和推广。如有违反，愿接受大赛组委会取消参赛资格、收回荣誉证书及奖金的处理。</w:t>
       </w:r>
     </w:p>
     <w:p>
       <w:r>
         <w:rPr>
           <w:rFonts w:ascii="Noto Serif CJK SC" w:hAnsi="Noto Serif CJK SC" w:eastAsia="Noto Serif CJK SC"/>
+          <w:color w:val="000000"/>
           <w:sz w:val="22"/>
         </w:rPr>
         <w:t>特此声明！</w:t>
@@ -87,18 +82,20 @@
       <w:r>
         <w:rPr>
           <w:rFonts w:ascii="Noto Serif CJK SC" w:hAnsi="Noto Serif CJK SC" w:eastAsia="Noto Serif CJK SC"/>
+          <w:color w:val="000000"/>
           <w:sz w:val="20"/>
         </w:rPr>
-        <w:t>参赛赛道：赛道一：AI+高等教育　所在高校（单位）：西安交通大学</w:t>
+        <w:t>参赛赛道：赛道二：AI+大学生创新创业　所在高校（单位）：西安交通大学</w:t>
       </w:r>
     </w:p>
     <w:p>
       <w:r>
         <w:rPr>
           <w:rFonts w:ascii="Noto Serif CJK SC" w:hAnsi="Noto Serif CJK SC" w:eastAsia="Noto Serif CJK SC"/>
+          <w:color w:val="000000"/>
           <w:sz w:val="20"/>
         </w:rPr>
-        <w:t>选题方向：AI+教学</w:t>
+        <w:t>选题方向：大学生OPC创新创业AI agent</w:t>
       </w:r>
     </w:p>
     <w:p>
@@ -106,6 +103,7 @@
         <w:rPr>
           <w:rFonts w:ascii="Noto Serif CJK SC" w:hAnsi="Noto Serif CJK SC" w:eastAsia="Noto Serif CJK SC"/>
           <w:b/>
+          <w:color w:val="000000"/>
           <w:sz w:val="22"/>
         </w:rPr>
         <w:t>声明人（团队负责人及全体成员签字）：</w:t>
@@ -135,6 +133,7 @@
             <w:r>
               <w:rPr>
                 <w:rFonts w:ascii="Noto Serif CJK SC" w:hAnsi="Noto Serif CJK SC" w:eastAsia="Noto Serif CJK SC"/>
+                <w:color w:val="000000"/>
                 <w:sz w:val="18"/>
               </w:rPr>
               <w:t>签字1：</w:t>
@@ -147,6 +146,7 @@
             <w:r>
               <w:rPr>
                 <w:rFonts w:ascii="Noto Serif CJK SC" w:hAnsi="Noto Serif CJK SC" w:eastAsia="Noto Serif CJK SC"/>
+                <w:color w:val="000000"/>
                 <w:sz w:val="22"/>
               </w:rPr>
               <w:t>________________________</w:t>
@@ -165,6 +165,7 @@
             <w:r>
               <w:rPr>
                 <w:rFonts w:ascii="Noto Serif CJK SC" w:hAnsi="Noto Serif CJK SC" w:eastAsia="Noto Serif CJK SC"/>
+                <w:color w:val="000000"/>
                 <w:sz w:val="18"/>
               </w:rPr>
               <w:t>签字2：</w:t>
@@ -177,6 +178,7 @@
             <w:r>
               <w:rPr>
                 <w:rFonts w:ascii="Noto Serif CJK SC" w:hAnsi="Noto Serif CJK SC" w:eastAsia="Noto Serif CJK SC"/>
+                <w:color w:val="000000"/>
                 <w:sz w:val="22"/>
               </w:rPr>
               <w:t>________________________</w:t>
@@ -197,6 +199,7 @@
             <w:r>
               <w:rPr>
                 <w:rFonts w:ascii="Noto Serif CJK SC" w:hAnsi="Noto Serif CJK SC" w:eastAsia="Noto Serif CJK SC"/>
+                <w:color w:val="000000"/>
                 <w:sz w:val="18"/>
               </w:rPr>
               <w:t>签字3：</w:t>
@@ -209,6 +212,7 @@
             <w:r>
               <w:rPr>
                 <w:rFonts w:ascii="Noto Serif CJK SC" w:hAnsi="Noto Serif CJK SC" w:eastAsia="Noto Serif CJK SC"/>
+                <w:color w:val="000000"/>
                 <w:sz w:val="22"/>
               </w:rPr>
               <w:t>________________________</w:t>
@@ -227,6 +231,7 @@
             <w:r>
               <w:rPr>
                 <w:rFonts w:ascii="Noto Serif CJK SC" w:hAnsi="Noto Serif CJK SC" w:eastAsia="Noto Serif CJK SC"/>
+                <w:color w:val="000000"/>
                 <w:sz w:val="18"/>
               </w:rPr>
               <w:t>签字4：</w:t>
@@ -239,6 +244,7 @@
             <w:r>
               <w:rPr>
                 <w:rFonts w:ascii="Noto Serif CJK SC" w:hAnsi="Noto Serif CJK SC" w:eastAsia="Noto Serif CJK SC"/>
+                <w:color w:val="000000"/>
                 <w:sz w:val="22"/>
               </w:rPr>
               <w:t>________________________</w:t>
@@ -254,6 +260,7 @@
       <w:r>
         <w:rPr>
           <w:rFonts w:ascii="Noto Serif CJK SC" w:hAnsi="Noto Serif CJK SC" w:eastAsia="Noto Serif CJK SC"/>
+          <w:color w:val="000000"/>
           <w:sz w:val="22"/>
         </w:rPr>
         <w:t>日期：________年________月________日</w:t>
@@ -702,7 +709,7 @@
       <w:rFonts w:asciiTheme="majorHAnsi" w:eastAsiaTheme="majorEastAsia" w:hAnsiTheme="majorHAnsi" w:cstheme="majorBidi" w:ascii="Noto Sans CJK SC" w:hAnsi="Noto Sans CJK SC" w:eastAsia="Noto Sans CJK SC"/>
       <w:b/>
       <w:bCs/>
-      <w:color w:val="244E44"/>
+      <w:color w:val="000000"/>
       <w:sz w:val="30"/>
       <w:szCs w:val="28"/>
     </w:rPr>
@@ -726,7 +733,7 @@
       <w:rFonts w:asciiTheme="majorHAnsi" w:eastAsiaTheme="majorEastAsia" w:hAnsiTheme="majorHAnsi" w:cstheme="majorBidi" w:ascii="Noto Sans CJK SC" w:hAnsi="Noto Sans CJK SC" w:eastAsia="Noto Sans CJK SC"/>
       <w:b/>
       <w:bCs/>
-      <w:color w:val="244E44"/>
+      <w:color w:val="000000"/>
       <w:sz w:val="24"/>
       <w:szCs w:val="26"/>
     </w:rPr>
@@ -750,7 +757,7 @@
       <w:rFonts w:asciiTheme="majorHAnsi" w:eastAsiaTheme="majorEastAsia" w:hAnsiTheme="majorHAnsi" w:cstheme="majorBidi" w:ascii="Noto Sans CJK SC" w:hAnsi="Noto Sans CJK SC" w:eastAsia="Noto Sans CJK SC"/>
       <w:b/>
       <w:bCs/>
-      <w:color w:val="244E44"/>
+      <w:color w:val="000000"/>
       <w:sz w:val="22"/>
     </w:rPr>
   </w:style>
@@ -982,15 +989,12 @@
     <w:qFormat/>
     <w:rsid w:val="00FC693F"/>
     <w:pPr>
-      <w:pBdr>
-        <w:bottom w:val="single" w:sz="8" w:space="4" w:color="4F81BD" w:themeColor="accent1"/>
-      </w:pBdr>
       <w:spacing w:after="300" w:line="240" w:lineRule="auto"/>
       <w:contextualSpacing/>
     </w:pPr>
     <w:rPr>
       <w:rFonts w:asciiTheme="majorHAnsi" w:eastAsiaTheme="majorEastAsia" w:hAnsiTheme="majorHAnsi" w:cstheme="majorBidi" w:ascii="Noto Sans CJK SC" w:hAnsi="Noto Sans CJK SC" w:eastAsia="Noto Sans CJK SC"/>
-      <w:color w:val="244E44"/>
+      <w:color w:val="000000"/>
       <w:spacing w:val="5"/>
       <w:kern w:val="28"/>
       <w:sz w:val="38"/>

</xml_diff>